<commit_message>
Remove reference to in-person testimony from Board Memo and Field Reference
Co-Authored-By: Claude Fable 5.1 <noreply@anthropic.com>
Claude-Session: https://claude.ai/code/session_01DfqmJDEjm2Gwtio86GAUCf
</commit_message>
<xml_diff>
--- a/documents/Titus_Ave_Board_Memo.docx
+++ b/documents/Titus_Ave_Board_Memo.docx
@@ -1004,23 +1004,6 @@
           <w:szCs w:val="20"/>
         </w:rPr>
         <w:t xml:space="preserve">The only valuation data in the record is the City's assessment card (App. p. 7): the parcel is assessed as vacant residential buildable land, and it sold in July 2024 for $150,000. The applicant's own by-right plan divides it into five building lots (App. p. 15). Nothing in the record suggests the conforming use is uneconomic; the open question under this criterion is the neighbors' values, and on that the record is silent.</w:t>
-      </w:r>
-    </w:p>
-    <w:p>
-      <w:pPr>
-        <w:pStyle w:val="ListParagraph"/>
-        <w:numPr>
-          <w:ilvl w:val="0"/>
-          <w:numId w:val="2"/>
-        </w:numPr>
-        <w:spacing w:after="70" w:line="290"/>
-      </w:pPr>
-      <w:r>
-        <w:rPr>
-          <w:sz w:val="20"/>
-          <w:szCs w:val="20"/>
-        </w:rPr>
-        <w:t xml:space="preserve">The Board is entitled to weigh testimony from nearby owners about the effect on their own properties. Several will speak at the hearing. The applicant has offered nothing to weigh against them.</w:t>
       </w:r>
     </w:p>
     <w:p>

</xml_diff>